<commit_message>
Add decision E5: open training crawlers for public pages
GPTBot, ClaudeBot, CCBot and Applebot-Extended were blocked by the
existing robots.txt. The plan now treats lifting that block as decision
E5 (recommended: allow on public pages, keep /api/, /admin/, /dashboard/
blocked) and L1 ships one grouped robots.txt rule.

Co-Authored-By: Claude Opus 5.5 <noreply@anthropic.com>
Claude-Session: https://claude.ai/code/session_01NMQaoUeHEbPLTJ9CdvHzwP
</commit_message>
<xml_diff>
--- a/reports/2026-10-28_GEO/GEO-Massnahmenplan_PageCompliance_Teil2.docx
+++ b/reports/2026-10-28_GEO/GEO-Massnahmenplan_PageCompliance_Teil2.docx
@@ -412,7 +412,7 @@
           <w:sz w:val="20"/>
           <w:szCs w:val="20"/>
         </w:rPr>
-        <w:t xml:space="preserve">Der Plan läuft in drei Wellen: sofort (diese Woche), in 30 Tagen, in 90 Tagen. Vier Entscheidungen stehen diese Woche an. Die Tabelle nennt sie mit Empfehlung; Abschnitt 4.3 zeigt die Fakten dahinter, Anhang A für jede Maßnahme den Befund, auf dem sie beruht.</w:t>
+        <w:t xml:space="preserve">Der Plan läuft in drei Wellen: sofort (diese Woche), in 30 Tagen, in 90 Tagen. Fünf Entscheidungen stehen diese Woche an. Die Tabelle nennt sie mit Empfehlung; Abschnitt 4.3 zeigt die Fakten dahinter, Anhang A für jede Maßnahme den Befund, auf dem sie beruht.</w:t>
       </w:r>
     </w:p>
     <w:tbl>
@@ -664,7 +664,7 @@
                 <w:sz w:val="16"/>
                 <w:szCs w:val="16"/>
               </w:rPr>
-              <w:t xml:space="preserve">ja; die Trainingssperre für alle anderen KI-Anbieter bleibt</w:t>
+              <w:t xml:space="preserve">ja</w:t>
             </w:r>
           </w:p>
         </w:tc>
@@ -1083,6 +1083,135 @@
                 <w:szCs w:val="16"/>
               </w:rPr>
               <w:t xml:space="preserve">3.3</w:t>
+            </w:r>
+          </w:p>
+        </w:tc>
+      </w:tr>
+      <w:tr>
+        <w:trPr>
+          <w:cantSplit/>
+        </w:trPr>
+        <w:tc>
+          <w:tcPr>
+            <w:tcW w:type="dxa" w:w="1303"/>
+            <w:tcBorders>
+              <w:top w:val="none" w:color="FFFFFF" w:sz="0"/>
+              <w:left w:val="none" w:color="FFFFFF" w:sz="0"/>
+              <w:bottom w:val="single" w:color="D6D6D6" w:sz="4"/>
+              <w:right w:val="none" w:color="FFFFFF" w:sz="0"/>
+            </w:tcBorders>
+            <w:tcMar>
+              <w:top w:type="dxa" w:w="60"/>
+              <w:left w:type="dxa" w:w="80"/>
+              <w:bottom w:type="dxa" w:w="60"/>
+              <w:right w:type="dxa" w:w="80"/>
+            </w:tcMar>
+          </w:tcPr>
+          <w:p>
+            <w:pPr>
+              <w:spacing w:after="0" w:line="250"/>
+            </w:pPr>
+            <w:r>
+              <w:rPr>
+                <w:rFonts w:ascii="Helvetica" w:cs="Helvetica" w:eastAsia="Helvetica" w:hAnsi="Helvetica"/>
+                <w:color w:val="1A1A1A"/>
+                <w:sz w:val="16"/>
+                <w:szCs w:val="16"/>
+              </w:rPr>
+              <w:t xml:space="preserve">E5</w:t>
+            </w:r>
+          </w:p>
+        </w:tc>
+        <w:tc>
+          <w:tcPr>
+            <w:tcW w:type="dxa" w:w="2792"/>
+            <w:tcBorders>
+              <w:top w:val="none" w:color="FFFFFF" w:sz="0"/>
+              <w:left w:val="none" w:color="FFFFFF" w:sz="0"/>
+              <w:bottom w:val="single" w:color="D6D6D6" w:sz="4"/>
+              <w:right w:val="none" w:color="FFFFFF" w:sz="0"/>
+            </w:tcBorders>
+            <w:tcMar>
+              <w:top w:type="dxa" w:w="60"/>
+              <w:left w:type="dxa" w:w="80"/>
+              <w:bottom w:type="dxa" w:w="60"/>
+              <w:right w:type="dxa" w:w="80"/>
+            </w:tcMar>
+          </w:tcPr>
+          <w:p>
+            <w:pPr>
+              <w:spacing w:after="0" w:line="250"/>
+            </w:pPr>
+            <w:r>
+              <w:rPr>
+                <w:rFonts w:ascii="Helvetica" w:cs="Helvetica" w:eastAsia="Helvetica" w:hAnsi="Helvetica"/>
+                <w:color w:val="1A1A1A"/>
+                <w:sz w:val="16"/>
+                <w:szCs w:val="16"/>
+              </w:rPr>
+              <w:t xml:space="preserve">Trainingssperre für GPTBot, ClaudeBot, CCBot und Applebot-Extended aufheben?</w:t>
+            </w:r>
+          </w:p>
+        </w:tc>
+        <w:tc>
+          <w:tcPr>
+            <w:tcW w:type="dxa" w:w="4095"/>
+            <w:tcBorders>
+              <w:top w:val="none" w:color="FFFFFF" w:sz="0"/>
+              <w:left w:val="none" w:color="FFFFFF" w:sz="0"/>
+              <w:bottom w:val="single" w:color="D6D6D6" w:sz="4"/>
+              <w:right w:val="none" w:color="FFFFFF" w:sz="0"/>
+            </w:tcBorders>
+            <w:tcMar>
+              <w:top w:type="dxa" w:w="60"/>
+              <w:left w:type="dxa" w:w="80"/>
+              <w:bottom w:type="dxa" w:w="60"/>
+              <w:right w:type="dxa" w:w="80"/>
+            </w:tcMar>
+          </w:tcPr>
+          <w:p>
+            <w:pPr>
+              <w:spacing w:after="0" w:line="250"/>
+            </w:pPr>
+            <w:r>
+              <w:rPr>
+                <w:rFonts w:ascii="Helvetica" w:cs="Helvetica" w:eastAsia="Helvetica" w:hAnsi="Helvetica"/>
+                <w:color w:val="1A1A1A"/>
+                <w:sz w:val="16"/>
+                <w:szCs w:val="16"/>
+              </w:rPr>
+              <w:t xml:space="preserve">ja, für die öffentlichen Seiten; /api/, /admin/, /dashboard/ bleiben gesperrt</w:t>
+            </w:r>
+          </w:p>
+        </w:tc>
+        <w:tc>
+          <w:tcPr>
+            <w:tcW w:type="dxa" w:w="1116"/>
+            <w:tcBorders>
+              <w:top w:val="none" w:color="FFFFFF" w:sz="0"/>
+              <w:left w:val="none" w:color="FFFFFF" w:sz="0"/>
+              <w:bottom w:val="single" w:color="D6D6D6" w:sz="4"/>
+              <w:right w:val="none" w:color="FFFFFF" w:sz="0"/>
+            </w:tcBorders>
+            <w:tcMar>
+              <w:top w:type="dxa" w:w="60"/>
+              <w:left w:type="dxa" w:w="80"/>
+              <w:bottom w:type="dxa" w:w="60"/>
+              <w:right w:type="dxa" w:w="80"/>
+            </w:tcMar>
+          </w:tcPr>
+          <w:p>
+            <w:pPr>
+              <w:spacing w:after="0" w:line="250"/>
+            </w:pPr>
+            <w:r>
+              <w:rPr>
+                <w:rFonts w:ascii="Helvetica" w:cs="Helvetica" w:eastAsia="Helvetica" w:hAnsi="Helvetica"/>
+                <w:color w:val="1A1A1A"/>
+                <w:sz w:val="16"/>
+                <w:szCs w:val="16"/>
+              </w:rPr>
+              <w:t xml:space="preserve">3.2</w:t>
             </w:r>
           </w:p>
         </w:tc>
@@ -2785,7 +2914,7 @@
           <w:sz w:val="20"/>
           <w:szCs w:val="20"/>
         </w:rPr>
-        <w:t xml:space="preserve">Die robots.txt sperrt Google-Extended und DuckAssistBot. Beide liefern Antworten an Nutzer, nicht nur Trainingsdaten. Gemini nennt PageCompliance deshalb in keiner von 15 Antworten und hält den Namen für einen Gattungsbegriff. Die Korrektur kostet zwei Zeilen; sie ist trotzdem eine Entscheidung, weil Google die Texte dann auch für Training nutzen darf (E1).</w:t>
+        <w:t xml:space="preserve">Die robots.txt sperrt Google-Extended und DuckAssistBot. Beide liefern Antworten an Nutzer, nicht nur Trainingsdaten. Gemini nennt PageCompliance deshalb in keiner von 15 Antworten und hält den Namen für einen Gattungsbegriff. Die Korrektur kostet zwei Zeilen; sie ist trotzdem eine Entscheidung, weil Google die Texte dann auch für Training nutzen darf (E1). Daneben sperrt die robots.txt vier reine Trainingscrawler. Das kostet keine Zitate in Antworten, hält PageCompliance aber aus den Trainingsdaten der großen Modelle heraus; ein Modell kennt die Marke dann nur, wenn es gerade im Netz sucht (E5).</w:t>
       </w:r>
     </w:p>
     <w:p>
@@ -4299,7 +4428,7 @@
                 <w:sz w:val="16"/>
                 <w:szCs w:val="16"/>
               </w:rPr>
-              <w:t xml:space="preserve">Google-Extended (nach E1) und DuckAssistBot freigeben; GPTBot, ClaudeBot, CCBot, Applebot-Extended bleiben gesperrt</w:t>
+              <w:t xml:space="preserve">Google-Extended (nach E1) und DuckAssistBot freigeben; nach E5 auch GPTBot, ClaudeBot, CCBot, Applebot-Extended; /api/, /admin/, /dashboard/ bleiben gesperrt</w:t>
             </w:r>
           </w:p>
         </w:tc>
@@ -4330,7 +4459,7 @@
                 <w:sz w:val="16"/>
                 <w:szCs w:val="16"/>
               </w:rPr>
-              <w:t xml:space="preserve">öffnet Gemini und DuckAssist; Trainingssperre für die anderen bleibt</w:t>
+              <w:t xml:space="preserve">öffnet Gemini und DuckAssist; bringt die öffentlichen Texte in die Trainingsdaten der großen Modelle</w:t>
             </w:r>
           </w:p>
         </w:tc>
@@ -4952,6 +5081,31 @@
           <w:szCs w:val="20"/>
         </w:rPr>
         <w:t xml:space="preserve"> Bei heute null Nennungen in Gemini ist die Freigabe ein lohnender Tausch. Sie ist notwendig, aber nicht ausreichend: Gemini zitiert zusätzlich, was bei Google rankt. Deshalb gehören die Arbeitsfelder 3.4 und 3.5 dazu.</w:t>
+      </w:r>
+    </w:p>
+    <w:p>
+      <w:pPr>
+        <w:spacing w:after="140" w:line="300"/>
+      </w:pPr>
+      <w:r>
+        <w:rPr>
+          <w:rFonts w:ascii="Helvetica" w:cs="Helvetica" w:eastAsia="Helvetica" w:hAnsi="Helvetica"/>
+          <w:b/>
+          <w:bCs/>
+          <w:color w:val="1A1A1A"/>
+          <w:sz w:val="20"/>
+          <w:szCs w:val="20"/>
+        </w:rPr>
+        <w:t xml:space="preserve">Entscheidung E5.</w:t>
+      </w:r>
+      <w:r>
+        <w:rPr>
+          <w:rFonts w:ascii="Helvetica" w:cs="Helvetica" w:eastAsia="Helvetica" w:hAnsi="Helvetica"/>
+          <w:color w:val="1A1A1A"/>
+          <w:sz w:val="20"/>
+          <w:szCs w:val="20"/>
+        </w:rPr>
+        <w:t xml:space="preserve"> Die Sperre für GPTBot, ClaudeBot, CCBot und Applebot-Extended stammt aus der bestehenden robots.txt. Sie schützt die Texte davor, Modelle zu trainieren, die dann dieselben Antworten kostenlos geben, und hält den Vorbehalt nach § 44b UrhG aufrecht. Dagegen steht der Engpass: Kaum ein Modell kennt PageCompliance. Was im Training steckt, weiß ein Modell auch ohne Websuche. CCBot wiegt am schwersten, weil Common Crawl breit für Trainingsdatensätze weiterverwendet wird. Öffentlich stehen Marketingtexte, die sich verbreiten sollen; die Prüflogik steht nicht auf der Website, und gewonnen wird laut Leitfaden über den Weg bis zur Freigabe. Empfehlung: freigeben für die öffentlichen Seiten. Zwei Vorbehalte: Der Effekt ist nicht belegt und frühestens mit der nächsten Modellgeneration sichtbar, und gesammelte Daten lassen sich nicht zurückholen.</w:t>
       </w:r>
     </w:p>
     <w:p>
@@ -13485,7 +13639,7 @@
                 <w:sz w:val="16"/>
                 <w:szCs w:val="16"/>
               </w:rPr>
-              <w:t xml:space="preserve">L1 robots.txt (nach E1) · L2 noindex /login, /register · L3 Titles, Metas, H1 · L4 Blog-Fußzeile (nach E3) · L5 llms.txt · L6 Sitemap · L7 Search Console, Bing, IndexNow</w:t>
+              <w:t xml:space="preserve">L1 robots.txt (nach E1 und E5) · L2 noindex /login, /register · L3 Titles, Metas, H1 · L4 Blog-Fußzeile (nach E3) · L5 llms.txt · L6 Sitemap · L7 Search Console, Bing, IndexNow</w:t>
             </w:r>
           </w:p>
         </w:tc>
@@ -13729,7 +13883,7 @@
         <w:keepNext/>
       </w:pPr>
       <w:r>
-        <w:t xml:space="preserve">4.3 Vier Entscheidungen für diese Woche</w:t>
+        <w:t xml:space="preserve">4.3 Fünf Entscheidungen für diese Woche</w:t>
       </w:r>
     </w:p>
     <w:tbl>
@@ -14012,7 +14166,7 @@
                 <w:sz w:val="15"/>
                 <w:szCs w:val="15"/>
               </w:rPr>
-              <w:t xml:space="preserve">Freigeben. Notwendig, aber nicht ausreichend: Gemini braucht zusätzlich Rankings. Der Vorbehalt nach § 44b UrhG gegenüber GPTBot, ClaudeBot, CCBot und Applebot-Extended bleibt.</w:t>
+              <w:t xml:space="preserve">Freigeben. Notwendig, aber nicht ausreichend: Gemini braucht zusätzlich Rankings.</w:t>
             </w:r>
           </w:p>
         </w:tc>
@@ -14400,6 +14554,135 @@
                 <w:szCs w:val="15"/>
               </w:rPr>
               <w:t xml:space="preserve">Seite „Compliance-Monitoring für Gesundheitswerbung“; App-Name „Wächter“; „Wächter“ und eine eigene Anmeldung von „PageCompliance“ vor dem Start prüfen lassen.</w:t>
+            </w:r>
+          </w:p>
+        </w:tc>
+      </w:tr>
+      <w:tr>
+        <w:trPr>
+          <w:cantSplit/>
+        </w:trPr>
+        <w:tc>
+          <w:tcPr>
+            <w:tcW w:type="dxa" w:w="558"/>
+            <w:tcBorders>
+              <w:top w:val="none" w:color="FFFFFF" w:sz="0"/>
+              <w:left w:val="none" w:color="FFFFFF" w:sz="0"/>
+              <w:bottom w:val="single" w:color="D6D6D6" w:sz="4"/>
+              <w:right w:val="none" w:color="FFFFFF" w:sz="0"/>
+            </w:tcBorders>
+            <w:tcMar>
+              <w:top w:type="dxa" w:w="60"/>
+              <w:left w:type="dxa" w:w="80"/>
+              <w:bottom w:type="dxa" w:w="60"/>
+              <w:right w:type="dxa" w:w="80"/>
+            </w:tcMar>
+          </w:tcPr>
+          <w:p>
+            <w:pPr>
+              <w:spacing w:after="0" w:line="250"/>
+            </w:pPr>
+            <w:r>
+              <w:rPr>
+                <w:rFonts w:ascii="Helvetica" w:cs="Helvetica" w:eastAsia="Helvetica" w:hAnsi="Helvetica"/>
+                <w:color w:val="1A1A1A"/>
+                <w:sz w:val="15"/>
+                <w:szCs w:val="15"/>
+              </w:rPr>
+              <w:t xml:space="preserve">E5</w:t>
+            </w:r>
+          </w:p>
+        </w:tc>
+        <w:tc>
+          <w:tcPr>
+            <w:tcW w:type="dxa" w:w="1675"/>
+            <w:tcBorders>
+              <w:top w:val="none" w:color="FFFFFF" w:sz="0"/>
+              <w:left w:val="none" w:color="FFFFFF" w:sz="0"/>
+              <w:bottom w:val="single" w:color="D6D6D6" w:sz="4"/>
+              <w:right w:val="none" w:color="FFFFFF" w:sz="0"/>
+            </w:tcBorders>
+            <w:tcMar>
+              <w:top w:type="dxa" w:w="60"/>
+              <w:left w:type="dxa" w:w="80"/>
+              <w:bottom w:type="dxa" w:w="60"/>
+              <w:right w:type="dxa" w:w="80"/>
+            </w:tcMar>
+          </w:tcPr>
+          <w:p>
+            <w:pPr>
+              <w:spacing w:after="0" w:line="250"/>
+            </w:pPr>
+            <w:r>
+              <w:rPr>
+                <w:rFonts w:ascii="Helvetica" w:cs="Helvetica" w:eastAsia="Helvetica" w:hAnsi="Helvetica"/>
+                <w:color w:val="1A1A1A"/>
+                <w:sz w:val="15"/>
+                <w:szCs w:val="15"/>
+              </w:rPr>
+              <w:t xml:space="preserve">Trainingssperre für GPTBot, ClaudeBot, CCBot und Applebot-Extended aufheben?</w:t>
+            </w:r>
+          </w:p>
+        </w:tc>
+        <w:tc>
+          <w:tcPr>
+            <w:tcW w:type="dxa" w:w="3722"/>
+            <w:tcBorders>
+              <w:top w:val="none" w:color="FFFFFF" w:sz="0"/>
+              <w:left w:val="none" w:color="FFFFFF" w:sz="0"/>
+              <w:bottom w:val="single" w:color="D6D6D6" w:sz="4"/>
+              <w:right w:val="none" w:color="FFFFFF" w:sz="0"/>
+            </w:tcBorders>
+            <w:tcMar>
+              <w:top w:type="dxa" w:w="60"/>
+              <w:left w:type="dxa" w:w="80"/>
+              <w:bottom w:type="dxa" w:w="60"/>
+              <w:right w:type="dxa" w:w="80"/>
+            </w:tcMar>
+          </w:tcPr>
+          <w:p>
+            <w:pPr>
+              <w:spacing w:after="0" w:line="250"/>
+            </w:pPr>
+            <w:r>
+              <w:rPr>
+                <w:rFonts w:ascii="Helvetica" w:cs="Helvetica" w:eastAsia="Helvetica" w:hAnsi="Helvetica"/>
+                <w:color w:val="1A1A1A"/>
+                <w:sz w:val="15"/>
+                <w:szCs w:val="15"/>
+              </w:rPr>
+              <w:t xml:space="preserve">GPTBot, ClaudeBot, CCBot und Applebot-Extended sammeln nur Trainingsdaten; die Zugänge für Antworten (OAI-SearchBot, ChatGPT-User, Claude-SearchBot, Claude-User, PerplexityBot) sind getrennt und schon offen. Common Crawl (CCBot) wird breit für Trainingsdatensätze weiterverwendet. Einmal gesammelte Daten bleiben in den Archiven.</w:t>
+            </w:r>
+          </w:p>
+        </w:tc>
+        <w:tc>
+          <w:tcPr>
+            <w:tcW w:type="dxa" w:w="3351"/>
+            <w:tcBorders>
+              <w:top w:val="none" w:color="FFFFFF" w:sz="0"/>
+              <w:left w:val="none" w:color="FFFFFF" w:sz="0"/>
+              <w:bottom w:val="single" w:color="D6D6D6" w:sz="4"/>
+              <w:right w:val="none" w:color="FFFFFF" w:sz="0"/>
+            </w:tcBorders>
+            <w:tcMar>
+              <w:top w:type="dxa" w:w="60"/>
+              <w:left w:type="dxa" w:w="80"/>
+              <w:bottom w:type="dxa" w:w="60"/>
+              <w:right w:type="dxa" w:w="80"/>
+            </w:tcMar>
+          </w:tcPr>
+          <w:p>
+            <w:pPr>
+              <w:spacing w:after="0" w:line="250"/>
+            </w:pPr>
+            <w:r>
+              <w:rPr>
+                <w:rFonts w:ascii="Helvetica" w:cs="Helvetica" w:eastAsia="Helvetica" w:hAnsi="Helvetica"/>
+                <w:color w:val="1A1A1A"/>
+                <w:sz w:val="15"/>
+                <w:szCs w:val="15"/>
+              </w:rPr>
+              <w:t xml:space="preserve">Freigeben für die öffentlichen Seiten; /api/, /admin/, /dashboard/ bleiben gesperrt. Der Engpass ist Bekanntheit, nicht Schutz: Öffentlich stehen Marketingtexte, die sich verbreiten sollen. Der Effekt ist nicht belegt und frühestens mit der nächsten Modellgeneration sichtbar.</w:t>
             </w:r>
           </w:p>
         </w:tc>
@@ -16342,7 +16625,7 @@
                 <w:sz w:val="16"/>
                 <w:szCs w:val="16"/>
               </w:rPr>
-              <w:t xml:space="preserve">1 E1 bis E4 entscheiden</w:t>
+              <w:t xml:space="preserve">1 E1 bis E5 entscheiden</w:t>
             </w:r>
           </w:p>
         </w:tc>
@@ -16373,7 +16656,7 @@
                 <w:sz w:val="16"/>
                 <w:szCs w:val="16"/>
               </w:rPr>
-              <w:t xml:space="preserve">Leon und Massi haben alle vier entschieden und notiert</w:t>
+              <w:t xml:space="preserve">Leon und Massi haben alle fünf entschieden und notiert</w:t>
             </w:r>
           </w:p>
         </w:tc>
@@ -18429,6 +18712,135 @@
                 <w:szCs w:val="15"/>
               </w:rPr>
               <w:t xml:space="preserve">TMview 27.10.</w:t>
+            </w:r>
+          </w:p>
+        </w:tc>
+      </w:tr>
+      <w:tr>
+        <w:trPr>
+          <w:cantSplit/>
+        </w:trPr>
+        <w:tc>
+          <w:tcPr>
+            <w:tcW w:type="dxa" w:w="1489"/>
+            <w:tcBorders>
+              <w:top w:val="none" w:color="FFFFFF" w:sz="0"/>
+              <w:left w:val="none" w:color="FFFFFF" w:sz="0"/>
+              <w:bottom w:val="single" w:color="D6D6D6" w:sz="4"/>
+              <w:right w:val="none" w:color="FFFFFF" w:sz="0"/>
+            </w:tcBorders>
+            <w:tcMar>
+              <w:top w:type="dxa" w:w="60"/>
+              <w:left w:type="dxa" w:w="80"/>
+              <w:bottom w:type="dxa" w:w="60"/>
+              <w:right w:type="dxa" w:w="80"/>
+            </w:tcMar>
+          </w:tcPr>
+          <w:p>
+            <w:pPr>
+              <w:spacing w:after="0" w:line="250"/>
+            </w:pPr>
+            <w:r>
+              <w:rPr>
+                <w:rFonts w:ascii="Helvetica" w:cs="Helvetica" w:eastAsia="Helvetica" w:hAnsi="Helvetica"/>
+                <w:color w:val="1A1A1A"/>
+                <w:sz w:val="15"/>
+                <w:szCs w:val="15"/>
+              </w:rPr>
+              <w:t xml:space="preserve">E5, L1</w:t>
+            </w:r>
+          </w:p>
+        </w:tc>
+        <w:tc>
+          <w:tcPr>
+            <w:tcW w:type="dxa" w:w="2606"/>
+            <w:tcBorders>
+              <w:top w:val="none" w:color="FFFFFF" w:sz="0"/>
+              <w:left w:val="none" w:color="FFFFFF" w:sz="0"/>
+              <w:bottom w:val="single" w:color="D6D6D6" w:sz="4"/>
+              <w:right w:val="none" w:color="FFFFFF" w:sz="0"/>
+            </w:tcBorders>
+            <w:tcMar>
+              <w:top w:type="dxa" w:w="60"/>
+              <w:left w:type="dxa" w:w="80"/>
+              <w:bottom w:type="dxa" w:w="60"/>
+              <w:right w:type="dxa" w:w="80"/>
+            </w:tcMar>
+          </w:tcPr>
+          <w:p>
+            <w:pPr>
+              <w:spacing w:after="0" w:line="250"/>
+            </w:pPr>
+            <w:r>
+              <w:rPr>
+                <w:rFonts w:ascii="Helvetica" w:cs="Helvetica" w:eastAsia="Helvetica" w:hAnsi="Helvetica"/>
+                <w:color w:val="1A1A1A"/>
+                <w:sz w:val="15"/>
+                <w:szCs w:val="15"/>
+              </w:rPr>
+              <w:t xml:space="preserve">Trainingscrawler freigeben</w:t>
+            </w:r>
+          </w:p>
+        </w:tc>
+        <w:tc>
+          <w:tcPr>
+            <w:tcW w:type="dxa" w:w="2978"/>
+            <w:tcBorders>
+              <w:top w:val="none" w:color="FFFFFF" w:sz="0"/>
+              <w:left w:val="none" w:color="FFFFFF" w:sz="0"/>
+              <w:bottom w:val="single" w:color="D6D6D6" w:sz="4"/>
+              <w:right w:val="none" w:color="FFFFFF" w:sz="0"/>
+            </w:tcBorders>
+            <w:tcMar>
+              <w:top w:type="dxa" w:w="60"/>
+              <w:left w:type="dxa" w:w="80"/>
+              <w:bottom w:type="dxa" w:w="60"/>
+              <w:right w:type="dxa" w:w="80"/>
+            </w:tcMar>
+          </w:tcPr>
+          <w:p>
+            <w:pPr>
+              <w:spacing w:after="0" w:line="250"/>
+            </w:pPr>
+            <w:r>
+              <w:rPr>
+                <w:rFonts w:ascii="Helvetica" w:cs="Helvetica" w:eastAsia="Helvetica" w:hAnsi="Helvetica"/>
+                <w:color w:val="1A1A1A"/>
+                <w:sz w:val="15"/>
+                <w:szCs w:val="15"/>
+              </w:rPr>
+              <w:t xml:space="preserve">kaum ein Modell kennt die Marke (Audit 2.3, 2.6)</w:t>
+            </w:r>
+          </w:p>
+        </w:tc>
+        <w:tc>
+          <w:tcPr>
+            <w:tcW w:type="dxa" w:w="2233"/>
+            <w:tcBorders>
+              <w:top w:val="none" w:color="FFFFFF" w:sz="0"/>
+              <w:left w:val="none" w:color="FFFFFF" w:sz="0"/>
+              <w:bottom w:val="single" w:color="D6D6D6" w:sz="4"/>
+              <w:right w:val="none" w:color="FFFFFF" w:sz="0"/>
+            </w:tcBorders>
+            <w:tcMar>
+              <w:top w:type="dxa" w:w="60"/>
+              <w:left w:type="dxa" w:w="80"/>
+              <w:bottom w:type="dxa" w:w="60"/>
+              <w:right w:type="dxa" w:w="80"/>
+            </w:tcMar>
+          </w:tcPr>
+          <w:p>
+            <w:pPr>
+              <w:spacing w:after="0" w:line="250"/>
+            </w:pPr>
+            <w:r>
+              <w:rPr>
+                <w:rFonts w:ascii="Helvetica" w:cs="Helvetica" w:eastAsia="Helvetica" w:hAnsi="Helvetica"/>
+                <w:color w:val="1A1A1A"/>
+                <w:sz w:val="15"/>
+                <w:szCs w:val="15"/>
+              </w:rPr>
+              <w:t xml:space="preserve">Anthropic Help Center; OpenAI-Dokumentation; Common Crawl</w:t>
             </w:r>
           </w:p>
         </w:tc>

</xml_diff>

<commit_message>
Add Massi task sheet and questions/rankings reference; move price page to Leon
Price page cleanup and price anchors are now Leon's task (L17) in the
plan and Leon's sheet. New Word files: Massi's task sheet and a reference
of all audit questions, rankings, competitors and a blank measurement table.

Co-Authored-By: Claude Opus 5.5 <noreply@anthropic.com>
Claude-Session: https://claude.ai/code/session_01NMQaoUeHEbPLTJ9CdvHzwP
</commit_message>
<xml_diff>
--- a/reports/2026-10-28_GEO/GEO-Massnahmenplan_PageCompliance_Teil2.docx
+++ b/reports/2026-10-28_GEO/GEO-Massnahmenplan_PageCompliance_Teil2.docx
@@ -4397,6 +4397,104 @@
                 <w:sz w:val="16"/>
                 <w:szCs w:val="16"/>
               </w:rPr>
+              <w:t xml:space="preserve">L17</w:t>
+            </w:r>
+          </w:p>
+        </w:tc>
+        <w:tc>
+          <w:tcPr>
+            <w:tcW w:type="dxa" w:w="4653"/>
+            <w:tcBorders>
+              <w:top w:val="none" w:color="FFFFFF" w:sz="0"/>
+              <w:left w:val="none" w:color="FFFFFF" w:sz="0"/>
+              <w:bottom w:val="single" w:color="D6D6D6" w:sz="4"/>
+              <w:right w:val="none" w:color="FFFFFF" w:sz="0"/>
+            </w:tcBorders>
+            <w:tcMar>
+              <w:top w:type="dxa" w:w="60"/>
+              <w:left w:type="dxa" w:w="80"/>
+              <w:bottom w:type="dxa" w:w="60"/>
+              <w:right w:type="dxa" w:w="80"/>
+            </w:tcMar>
+          </w:tcPr>
+          <w:p>
+            <w:pPr>
+              <w:spacing w:after="0" w:line="250"/>
+            </w:pPr>
+            <w:r>
+              <w:rPr>
+                <w:rFonts w:ascii="Helvetica" w:cs="Helvetica" w:eastAsia="Helvetica" w:hAnsi="Helvetica"/>
+                <w:color w:val="1A1A1A"/>
+                <w:sz w:val="16"/>
+                <w:szCs w:val="16"/>
+              </w:rPr>
+              <w:t xml:space="preserve">Preisseite bereinigen: unbelegte Zahlen, „White-Label“, „Video-Audit“, „Spezialisten für jeden HWG-Paragrafen“ raus; Preisanker mit Quelle</w:t>
+            </w:r>
+          </w:p>
+        </w:tc>
+        <w:tc>
+          <w:tcPr>
+            <w:tcW w:type="dxa" w:w="4002"/>
+            <w:tcBorders>
+              <w:top w:val="none" w:color="FFFFFF" w:sz="0"/>
+              <w:left w:val="none" w:color="FFFFFF" w:sz="0"/>
+              <w:bottom w:val="single" w:color="D6D6D6" w:sz="4"/>
+              <w:right w:val="none" w:color="FFFFFF" w:sz="0"/>
+            </w:tcBorders>
+            <w:tcMar>
+              <w:top w:type="dxa" w:w="60"/>
+              <w:left w:type="dxa" w:w="80"/>
+              <w:bottom w:type="dxa" w:w="60"/>
+              <w:right w:type="dxa" w:w="80"/>
+            </w:tcMar>
+          </w:tcPr>
+          <w:p>
+            <w:pPr>
+              <w:spacing w:after="0" w:line="250"/>
+            </w:pPr>
+            <w:r>
+              <w:rPr>
+                <w:rFonts w:ascii="Helvetica" w:cs="Helvetica" w:eastAsia="Helvetica" w:hAnsi="Helvetica"/>
+                <w:color w:val="1A1A1A"/>
+                <w:sz w:val="16"/>
+                <w:szCs w:val="16"/>
+              </w:rPr>
+              <w:t xml:space="preserve">Leon verantwortet die Preise; unbelegte Zahlen sind ein UWG-Risiko</w:t>
+            </w:r>
+          </w:p>
+        </w:tc>
+      </w:tr>
+      <w:tr>
+        <w:trPr>
+          <w:cantSplit/>
+        </w:trPr>
+        <w:tc>
+          <w:tcPr>
+            <w:tcW w:type="dxa" w:w="651"/>
+            <w:tcBorders>
+              <w:top w:val="none" w:color="FFFFFF" w:sz="0"/>
+              <w:left w:val="none" w:color="FFFFFF" w:sz="0"/>
+              <w:bottom w:val="single" w:color="D6D6D6" w:sz="4"/>
+              <w:right w:val="none" w:color="FFFFFF" w:sz="0"/>
+            </w:tcBorders>
+            <w:tcMar>
+              <w:top w:type="dxa" w:w="60"/>
+              <w:left w:type="dxa" w:w="80"/>
+              <w:bottom w:type="dxa" w:w="60"/>
+              <w:right w:type="dxa" w:w="80"/>
+            </w:tcMar>
+          </w:tcPr>
+          <w:p>
+            <w:pPr>
+              <w:spacing w:after="0" w:line="250"/>
+            </w:pPr>
+            <w:r>
+              <w:rPr>
+                <w:rFonts w:ascii="Helvetica" w:cs="Helvetica" w:eastAsia="Helvetica" w:hAnsi="Helvetica"/>
+                <w:color w:val="1A1A1A"/>
+                <w:sz w:val="16"/>
+                <w:szCs w:val="16"/>
+              </w:rPr>
               <w:t xml:space="preserve">L1</w:t>
             </w:r>
           </w:p>
@@ -6322,7 +6420,7 @@
           <w:sz w:val="20"/>
           <w:szCs w:val="20"/>
         </w:rPr>
-        <w:t xml:space="preserve"> Massi schreibt die Texte, Leon baut sie ein:</w:t>
+        <w:t xml:space="preserve"> Die Preisseite übernimmt Leon ganz, weil er die Preise verantwortet. Die übrigen Texte schreibt Massi, Leon baut sie ein:</w:t>
       </w:r>
     </w:p>
     <w:p>
@@ -6343,7 +6441,7 @@
           <w:sz w:val="20"/>
           <w:szCs w:val="20"/>
         </w:rPr>
-        <w:t xml:space="preserve">Preisseite (M1, sofort).</w:t>
+        <w:t xml:space="preserve">Preisseite (L17, Leon, sofort).</w:t>
       </w:r>
       <w:r>
         <w:rPr>
@@ -11461,7 +11559,7 @@
           <w:sz w:val="20"/>
           <w:szCs w:val="20"/>
         </w:rPr>
-        <w:t xml:space="preserve">Massis Teil löst den eigentlichen Engpass: einheitliche Beschreibung, korrekte Inhalte, fremde Stimmen. Die Nummern M1, M3, M5, M6, M7, M10 und M12 tauchen bei Leon als Abhängigkeit auf.</w:t>
+        <w:t xml:space="preserve">Massis Teil löst den eigentlichen Engpass: einheitliche Beschreibung, korrekte Inhalte, fremde Stimmen. Die Nummern M3, M5, M6, M7, M10 und M12 tauchen bei Leon als Abhängigkeit auf. Preisseite und Preisanker liegen bei Leon (L17).</w:t>
       </w:r>
     </w:p>
     <w:tbl>
@@ -11651,7 +11749,7 @@
                 <w:sz w:val="15"/>
                 <w:szCs w:val="15"/>
               </w:rPr>
-              <w:t xml:space="preserve">M1</w:t>
+              <w:t xml:space="preserve">M2</w:t>
             </w:r>
           </w:p>
         </w:tc>
@@ -11713,7 +11811,7 @@
                 <w:sz w:val="15"/>
                 <w:szCs w:val="15"/>
               </w:rPr>
-              <w:t xml:space="preserve">Preisseite neu texten: unbelegte Zahlen, „White-Label“, „Video-Audit“, „Spezialisten für jeden HWG-Paragrafen“ raus</w:t>
+              <w:t xml:space="preserve">LinkedIn-Info und Munich Startup auf die Definition; FinTech und InsurTech entfernen lassen</w:t>
             </w:r>
           </w:p>
         </w:tc>
@@ -11744,7 +11842,7 @@
                 <w:sz w:val="15"/>
                 <w:szCs w:val="15"/>
               </w:rPr>
-              <w:t xml:space="preserve">Text liegt bei Leon; jede Zahl steht in der Belegt-Liste oder hat Quelle und Screenshot</w:t>
+              <w:t xml:space="preserve">beide Profile tragen die Definition wörtlich</w:t>
             </w:r>
           </w:p>
         </w:tc>
@@ -11780,7 +11878,7 @@
                 <w:sz w:val="15"/>
                 <w:szCs w:val="15"/>
               </w:rPr>
-              <w:t xml:space="preserve">M2</w:t>
+              <w:t xml:space="preserve">M3</w:t>
             </w:r>
           </w:p>
         </w:tc>
@@ -11842,7 +11940,7 @@
                 <w:sz w:val="15"/>
                 <w:szCs w:val="15"/>
               </w:rPr>
-              <w:t xml:space="preserve">LinkedIn-Info und Munich Startup auf die Definition; FinTech und InsurTech entfernen lassen</w:t>
+              <w:t xml:space="preserve">Text für /ueber-uns mit Faktenblock</w:t>
             </w:r>
           </w:p>
         </w:tc>
@@ -11873,7 +11971,7 @@
                 <w:sz w:val="15"/>
                 <w:szCs w:val="15"/>
               </w:rPr>
-              <w:t xml:space="preserve">beide Profile tragen die Definition wörtlich</w:t>
+              <w:t xml:space="preserve">Text liegt bei Leon</w:t>
             </w:r>
           </w:p>
         </w:tc>
@@ -11909,7 +12007,7 @@
                 <w:sz w:val="15"/>
                 <w:szCs w:val="15"/>
               </w:rPr>
-              <w:t xml:space="preserve">M3</w:t>
+              <w:t xml:space="preserve">M4</w:t>
             </w:r>
           </w:p>
         </w:tc>
@@ -11971,7 +12069,7 @@
                 <w:sz w:val="15"/>
                 <w:szCs w:val="15"/>
               </w:rPr>
-              <w:t xml:space="preserve">Text für /ueber-uns mit Faktenblock</w:t>
+              <w:t xml:space="preserve">Vorher-Nachher-Artikel um BGH I ZR 170/24 korrigieren, mit Link zur Quelle</w:t>
             </w:r>
           </w:p>
         </w:tc>
@@ -12002,7 +12100,7 @@
                 <w:sz w:val="15"/>
                 <w:szCs w:val="15"/>
               </w:rPr>
-              <w:t xml:space="preserve">Text liegt bei Leon</w:t>
+              <w:t xml:space="preserve">Kurzantwort und Text nennen Unterspritzungen</w:t>
             </w:r>
           </w:p>
         </w:tc>
@@ -12038,7 +12136,7 @@
                 <w:sz w:val="15"/>
                 <w:szCs w:val="15"/>
               </w:rPr>
-              <w:t xml:space="preserve">M4</w:t>
+              <w:t xml:space="preserve">M5</w:t>
             </w:r>
           </w:p>
         </w:tc>
@@ -12069,7 +12167,7 @@
                 <w:sz w:val="15"/>
                 <w:szCs w:val="15"/>
               </w:rPr>
-              <w:t xml:space="preserve">sofort</w:t>
+              <w:t xml:space="preserve">30 Tage</w:t>
             </w:r>
           </w:p>
         </w:tc>
@@ -12100,7 +12198,7 @@
                 <w:sz w:val="15"/>
                 <w:szCs w:val="15"/>
               </w:rPr>
-              <w:t xml:space="preserve">Vorher-Nachher-Artikel um BGH I ZR 170/24 korrigieren, mit Link zur Quelle</w:t>
+              <w:t xml:space="preserve">Vorfilter-Artikel neu schreiben, etwa „Was eine Prüfung für Gesundheitswerbung leistet und wo die Kanzlei übernimmt“</w:t>
             </w:r>
           </w:p>
         </w:tc>
@@ -12131,7 +12229,7 @@
                 <w:sz w:val="15"/>
                 <w:szCs w:val="15"/>
               </w:rPr>
-              <w:t xml:space="preserve">Kurzantwort und Text nennen Unterspritzungen</w:t>
+              <w:t xml:space="preserve">kein „Vorfilter“, kein „KEINE PRÜFUNG“</w:t>
             </w:r>
           </w:p>
         </w:tc>
@@ -12167,7 +12265,7 @@
                 <w:sz w:val="15"/>
                 <w:szCs w:val="15"/>
               </w:rPr>
-              <w:t xml:space="preserve">M5</w:t>
+              <w:t xml:space="preserve">M6</w:t>
             </w:r>
           </w:p>
         </w:tc>
@@ -12229,7 +12327,7 @@
                 <w:sz w:val="15"/>
                 <w:szCs w:val="15"/>
               </w:rPr>
-              <w:t xml:space="preserve">Vorfilter-Artikel neu schreiben, etwa „Was eine Prüfung für Gesundheitswerbung leistet und wo die Kanzlei übernimmt“</w:t>
+              <w:t xml:space="preserve">Immunsystem-Artikel zusammenführen unter /blog/nem-immunsystem-claims-erlaubt</w:t>
             </w:r>
           </w:p>
         </w:tc>
@@ -12260,7 +12358,7 @@
                 <w:sz w:val="15"/>
                 <w:szCs w:val="15"/>
               </w:rPr>
-              <w:t xml:space="preserve">kein „Vorfilter“, kein „KEINE PRÜFUNG“</w:t>
+              <w:t xml:space="preserve">ein Artikel mit Wortlaut der zugelassenen Claims</w:t>
             </w:r>
           </w:p>
         </w:tc>
@@ -12296,7 +12394,7 @@
                 <w:sz w:val="15"/>
                 <w:szCs w:val="15"/>
               </w:rPr>
-              <w:t xml:space="preserve">M6</w:t>
+              <w:t xml:space="preserve">M7</w:t>
             </w:r>
           </w:p>
         </w:tc>
@@ -12358,7 +12456,7 @@
                 <w:sz w:val="15"/>
                 <w:szCs w:val="15"/>
               </w:rPr>
-              <w:t xml:space="preserve">Immunsystem-Artikel zusammenführen unter /blog/nem-immunsystem-claims-erlaubt</w:t>
+              <w:t xml:space="preserve">OMR Reviews, Crunchbase, G2 anlegen</w:t>
             </w:r>
           </w:p>
         </w:tc>
@@ -12389,7 +12487,7 @@
                 <w:sz w:val="15"/>
                 <w:szCs w:val="15"/>
               </w:rPr>
-              <w:t xml:space="preserve">ein Artikel mit Wortlaut der zugelassenen Claims</w:t>
+              <w:t xml:space="preserve">drei Profile mit Definition</w:t>
             </w:r>
           </w:p>
         </w:tc>
@@ -12425,7 +12523,7 @@
                 <w:sz w:val="15"/>
                 <w:szCs w:val="15"/>
               </w:rPr>
-              <w:t xml:space="preserve">M7</w:t>
+              <w:t xml:space="preserve">M8</w:t>
             </w:r>
           </w:p>
         </w:tc>
@@ -12487,7 +12585,7 @@
                 <w:sz w:val="15"/>
                 <w:szCs w:val="15"/>
               </w:rPr>
-              <w:t xml:space="preserve">OMR Reviews, Crunchbase, G2 anlegen</w:t>
+              <w:t xml:space="preserve">neue Artikel 1 bis 4 nach dem Muster</w:t>
             </w:r>
           </w:p>
         </w:tc>
@@ -12518,7 +12616,7 @@
                 <w:sz w:val="15"/>
                 <w:szCs w:val="15"/>
               </w:rPr>
-              <w:t xml:space="preserve">drei Profile mit Definition</w:t>
+              <w:t xml:space="preserve">je Artikel Schritte 1 bis 3 erledigt</w:t>
             </w:r>
           </w:p>
         </w:tc>
@@ -12554,7 +12652,7 @@
                 <w:sz w:val="15"/>
                 <w:szCs w:val="15"/>
               </w:rPr>
-              <w:t xml:space="preserve">M8</w:t>
+              <w:t xml:space="preserve">M9</w:t>
             </w:r>
           </w:p>
         </w:tc>
@@ -12616,7 +12714,7 @@
                 <w:sz w:val="15"/>
                 <w:szCs w:val="15"/>
               </w:rPr>
-              <w:t xml:space="preserve">neue Artikel 1 bis 4 nach dem Muster</w:t>
+              <w:t xml:space="preserve">sechs Partner-Agenturen ansprechen</w:t>
             </w:r>
           </w:p>
         </w:tc>
@@ -12647,7 +12745,7 @@
                 <w:sz w:val="15"/>
                 <w:szCs w:val="15"/>
               </w:rPr>
-              <w:t xml:space="preserve">je Artikel Schritte 1 bis 3 erledigt</w:t>
+              <w:t xml:space="preserve">mindestens zwei Zusagen für Gastbeitrag oder Erwähnung</w:t>
             </w:r>
           </w:p>
         </w:tc>
@@ -12683,7 +12781,7 @@
                 <w:sz w:val="15"/>
                 <w:szCs w:val="15"/>
               </w:rPr>
-              <w:t xml:space="preserve">M9</w:t>
+              <w:t xml:space="preserve">M11</w:t>
             </w:r>
           </w:p>
         </w:tc>
@@ -12714,7 +12812,7 @@
                 <w:sz w:val="15"/>
                 <w:szCs w:val="15"/>
               </w:rPr>
-              <w:t xml:space="preserve">30 Tage</w:t>
+              <w:t xml:space="preserve">laufend</w:t>
             </w:r>
           </w:p>
         </w:tc>
@@ -12745,7 +12843,7 @@
                 <w:sz w:val="15"/>
                 <w:szCs w:val="15"/>
               </w:rPr>
-              <w:t xml:space="preserve">sechs Partner-Agenturen ansprechen</w:t>
+              <w:t xml:space="preserve">jeder Artikel ein LinkedIn-Beitrag</w:t>
             </w:r>
           </w:p>
         </w:tc>
@@ -12776,7 +12874,7 @@
                 <w:sz w:val="15"/>
                 <w:szCs w:val="15"/>
               </w:rPr>
-              <w:t xml:space="preserve">mindestens zwei Zusagen für Gastbeitrag oder Erwähnung</w:t>
+              <w:t xml:space="preserve">Beitrag binnen 14 Tagen nach Veröffentlichung</w:t>
             </w:r>
           </w:p>
         </w:tc>
@@ -12812,7 +12910,7 @@
                 <w:sz w:val="15"/>
                 <w:szCs w:val="15"/>
               </w:rPr>
-              <w:t xml:space="preserve">M11</w:t>
+              <w:t xml:space="preserve">M12</w:t>
             </w:r>
           </w:p>
         </w:tc>
@@ -12843,7 +12941,7 @@
                 <w:sz w:val="15"/>
                 <w:szCs w:val="15"/>
               </w:rPr>
-              <w:t xml:space="preserve">laufend</w:t>
+              <w:t xml:space="preserve">30 Tage</w:t>
             </w:r>
           </w:p>
         </w:tc>
@@ -12874,7 +12972,7 @@
                 <w:sz w:val="15"/>
                 <w:szCs w:val="15"/>
               </w:rPr>
-              <w:t xml:space="preserve">jeder Artikel ein LinkedIn-Beitrag</w:t>
+              <w:t xml:space="preserve">Startseiten-Texte: Ersatz für „Für jede Regel ein Spezialist“ und „12 Paragrafen“; Zeile unter der H1; Titles und Meta-Descriptions</w:t>
             </w:r>
           </w:p>
         </w:tc>
@@ -12905,7 +13003,7 @@
                 <w:sz w:val="15"/>
                 <w:szCs w:val="15"/>
               </w:rPr>
-              <w:t xml:space="preserve">Beitrag binnen 14 Tagen nach Veröffentlichung</w:t>
+              <w:t xml:space="preserve">Text liegt bei Leon</w:t>
             </w:r>
           </w:p>
         </w:tc>
@@ -12941,7 +13039,7 @@
                 <w:sz w:val="15"/>
                 <w:szCs w:val="15"/>
               </w:rPr>
-              <w:t xml:space="preserve">M12</w:t>
+              <w:t xml:space="preserve">M10</w:t>
             </w:r>
           </w:p>
         </w:tc>
@@ -12972,7 +13070,7 @@
                 <w:sz w:val="15"/>
                 <w:szCs w:val="15"/>
               </w:rPr>
-              <w:t xml:space="preserve">30 Tage</w:t>
+              <w:t xml:space="preserve">90 Tage</w:t>
             </w:r>
           </w:p>
         </w:tc>
@@ -13003,7 +13101,7 @@
                 <w:sz w:val="15"/>
                 <w:szCs w:val="15"/>
               </w:rPr>
-              <w:t xml:space="preserve">Startseiten-Texte: Ersatz für „Für jede Regel ein Spezialist“ und „12 Paragrafen“; Zeile unter der H1; Titles und Meta-Descriptions</w:t>
+              <w:t xml:space="preserve">Text für die Vergleichsseite nach Kategorien</w:t>
             </w:r>
           </w:p>
         </w:tc>
@@ -13034,7 +13132,7 @@
                 <w:sz w:val="15"/>
                 <w:szCs w:val="15"/>
               </w:rPr>
-              <w:t xml:space="preserve">Text liegt bei Leon</w:t>
+              <w:t xml:space="preserve">gegengelesen (M14)</w:t>
             </w:r>
           </w:p>
         </w:tc>
@@ -13070,7 +13168,7 @@
                 <w:sz w:val="15"/>
                 <w:szCs w:val="15"/>
               </w:rPr>
-              <w:t xml:space="preserve">M10</w:t>
+              <w:t xml:space="preserve">M13</w:t>
             </w:r>
           </w:p>
         </w:tc>
@@ -13132,7 +13230,7 @@
                 <w:sz w:val="15"/>
                 <w:szCs w:val="15"/>
               </w:rPr>
-              <w:t xml:space="preserve">Text für die Vergleichsseite nach Kategorien</w:t>
+              <w:t xml:space="preserve">Wiederholungsmessung: 20 Suchbegriffe, 15 Fragen je dreimal, Search Console, Bing</w:t>
             </w:r>
           </w:p>
         </w:tc>
@@ -13163,7 +13261,7 @@
                 <w:sz w:val="15"/>
                 <w:szCs w:val="15"/>
               </w:rPr>
-              <w:t xml:space="preserve">gegengelesen (M14)</w:t>
+              <w:t xml:space="preserve">Vergleich mit den Ausgangswerten liegt vor</w:t>
             </w:r>
           </w:p>
         </w:tc>
@@ -13199,7 +13297,7 @@
                 <w:sz w:val="15"/>
                 <w:szCs w:val="15"/>
               </w:rPr>
-              <w:t xml:space="preserve">M13</w:t>
+              <w:t xml:space="preserve">M14</w:t>
             </w:r>
           </w:p>
         </w:tc>
@@ -13261,136 +13359,7 @@
                 <w:sz w:val="15"/>
                 <w:szCs w:val="15"/>
               </w:rPr>
-              <w:t xml:space="preserve">Wiederholungsmessung: 20 Suchbegriffe, 15 Fragen je dreimal, Search Console, Bing</w:t>
-            </w:r>
-          </w:p>
-        </w:tc>
-        <w:tc>
-          <w:tcPr>
-            <w:tcW w:type="dxa" w:w="3164"/>
-            <w:tcBorders>
-              <w:top w:val="none" w:color="FFFFFF" w:sz="0"/>
-              <w:left w:val="none" w:color="FFFFFF" w:sz="0"/>
-              <w:bottom w:val="single" w:color="D6D6D6" w:sz="4"/>
-              <w:right w:val="none" w:color="FFFFFF" w:sz="0"/>
-            </w:tcBorders>
-            <w:tcMar>
-              <w:top w:type="dxa" w:w="60"/>
-              <w:left w:type="dxa" w:w="80"/>
-              <w:bottom w:type="dxa" w:w="60"/>
-              <w:right w:type="dxa" w:w="80"/>
-            </w:tcMar>
-          </w:tcPr>
-          <w:p>
-            <w:pPr>
-              <w:spacing w:after="0" w:line="250"/>
-            </w:pPr>
-            <w:r>
-              <w:rPr>
-                <w:rFonts w:ascii="Helvetica" w:cs="Helvetica" w:eastAsia="Helvetica" w:hAnsi="Helvetica"/>
-                <w:color w:val="1A1A1A"/>
-                <w:sz w:val="15"/>
-                <w:szCs w:val="15"/>
-              </w:rPr>
-              <w:t xml:space="preserve">Vergleich mit den Ausgangswerten liegt vor</w:t>
-            </w:r>
-          </w:p>
-        </w:tc>
-      </w:tr>
-      <w:tr>
-        <w:trPr>
-          <w:cantSplit/>
-        </w:trPr>
-        <w:tc>
-          <w:tcPr>
-            <w:tcW w:type="dxa" w:w="558"/>
-            <w:tcBorders>
-              <w:top w:val="none" w:color="FFFFFF" w:sz="0"/>
-              <w:left w:val="none" w:color="FFFFFF" w:sz="0"/>
-              <w:bottom w:val="single" w:color="D6D6D6" w:sz="4"/>
-              <w:right w:val="none" w:color="FFFFFF" w:sz="0"/>
-            </w:tcBorders>
-            <w:tcMar>
-              <w:top w:type="dxa" w:w="60"/>
-              <w:left w:type="dxa" w:w="80"/>
-              <w:bottom w:type="dxa" w:w="60"/>
-              <w:right w:type="dxa" w:w="80"/>
-            </w:tcMar>
-          </w:tcPr>
-          <w:p>
-            <w:pPr>
-              <w:spacing w:after="0" w:line="250"/>
-            </w:pPr>
-            <w:r>
-              <w:rPr>
-                <w:rFonts w:ascii="Helvetica" w:cs="Helvetica" w:eastAsia="Helvetica" w:hAnsi="Helvetica"/>
-                <w:color w:val="1A1A1A"/>
-                <w:sz w:val="15"/>
-                <w:szCs w:val="15"/>
-              </w:rPr>
-              <w:t xml:space="preserve">M14</w:t>
-            </w:r>
-          </w:p>
-        </w:tc>
-        <w:tc>
-          <w:tcPr>
-            <w:tcW w:type="dxa" w:w="931"/>
-            <w:tcBorders>
-              <w:top w:val="none" w:color="FFFFFF" w:sz="0"/>
-              <w:left w:val="none" w:color="FFFFFF" w:sz="0"/>
-              <w:bottom w:val="single" w:color="D6D6D6" w:sz="4"/>
-              <w:right w:val="none" w:color="FFFFFF" w:sz="0"/>
-            </w:tcBorders>
-            <w:tcMar>
-              <w:top w:type="dxa" w:w="60"/>
-              <w:left w:type="dxa" w:w="80"/>
-              <w:bottom w:type="dxa" w:w="60"/>
-              <w:right w:type="dxa" w:w="80"/>
-            </w:tcMar>
-          </w:tcPr>
-          <w:p>
-            <w:pPr>
-              <w:spacing w:after="0" w:line="250"/>
-            </w:pPr>
-            <w:r>
-              <w:rPr>
-                <w:rFonts w:ascii="Helvetica" w:cs="Helvetica" w:eastAsia="Helvetica" w:hAnsi="Helvetica"/>
-                <w:color w:val="1A1A1A"/>
-                <w:sz w:val="15"/>
-                <w:szCs w:val="15"/>
-              </w:rPr>
-              <w:t xml:space="preserve">90 Tage</w:t>
-            </w:r>
-          </w:p>
-        </w:tc>
-        <w:tc>
-          <w:tcPr>
-            <w:tcW w:type="dxa" w:w="4653"/>
-            <w:tcBorders>
-              <w:top w:val="none" w:color="FFFFFF" w:sz="0"/>
-              <w:left w:val="none" w:color="FFFFFF" w:sz="0"/>
-              <w:bottom w:val="single" w:color="D6D6D6" w:sz="4"/>
-              <w:right w:val="none" w:color="FFFFFF" w:sz="0"/>
-            </w:tcBorders>
-            <w:tcMar>
-              <w:top w:type="dxa" w:w="60"/>
-              <w:left w:type="dxa" w:w="80"/>
-              <w:bottom w:type="dxa" w:w="60"/>
-              <w:right w:type="dxa" w:w="80"/>
-            </w:tcMar>
-          </w:tcPr>
-          <w:p>
-            <w:pPr>
-              <w:spacing w:after="0" w:line="250"/>
-            </w:pPr>
-            <w:r>
-              <w:rPr>
-                <w:rFonts w:ascii="Helvetica" w:cs="Helvetica" w:eastAsia="Helvetica" w:hAnsi="Helvetica"/>
-                <w:color w:val="1A1A1A"/>
-                <w:sz w:val="15"/>
-                <w:szCs w:val="15"/>
-              </w:rPr>
-              <w:t xml:space="preserve">anwaltlich gegenlesen lassen: Abmahnschutz-Formulierungen, Preisanker, Hinweiszeile im Blog (E3), Artikel 2</w:t>
+              <w:t xml:space="preserve">anwaltlich gegenlesen lassen: Abmahnschutz-Formulierungen, Hinweiszeile im Blog (E3), Artikel 2</w:t>
             </w:r>
           </w:p>
         </w:tc>
@@ -13639,7 +13608,7 @@
                 <w:sz w:val="16"/>
                 <w:szCs w:val="16"/>
               </w:rPr>
-              <w:t xml:space="preserve">L1 robots.txt (nach E1 und E5) · L2 noindex /login, /register · L3 Titles, Metas, H1 · L4 Blog-Fußzeile (nach E3) · L5 llms.txt · L6 Sitemap · L7 Search Console, Bing, IndexNow</w:t>
+              <w:t xml:space="preserve">L17 Preisseite bereinigen · L1 robots.txt (nach E1 und E5) · L2 noindex /login, /register · L3 Titles, Metas, H1 · L4 Blog-Fußzeile (nach E3) · L5 llms.txt · L6 Sitemap · L7 Search Console, Bing, IndexNow</w:t>
             </w:r>
           </w:p>
         </w:tc>
@@ -13670,7 +13639,7 @@
                 <w:sz w:val="16"/>
                 <w:szCs w:val="16"/>
               </w:rPr>
-              <w:t xml:space="preserve">etwa 5 Stunden</w:t>
+              <w:t xml:space="preserve">etwa 5 Stunden plus Preisseite</w:t>
             </w:r>
           </w:p>
         </w:tc>
@@ -14295,7 +14264,7 @@
                 <w:sz w:val="15"/>
                 <w:szCs w:val="15"/>
               </w:rPr>
-              <w:t xml:space="preserve">Preise v2 mit dem Upgrade live. Bis dahin unbelegte Zahlen raus (M1), kein Preis-Markup, keine Preise in neuen Artikeln. Markup zuerst für Gratis, Agentur, Team.</w:t>
+              <w:t xml:space="preserve">Leon entscheidet. Preise v2 mit dem Upgrade live. Bis dahin unbelegte Zahlen raus (L17), kein Preis-Markup, keine Preise in neuen Artikeln. Markup zuerst für Gratis, Agentur, Team.</w:t>
             </w:r>
           </w:p>
         </w:tc>
@@ -15080,7 +15049,7 @@
                 <w:sz w:val="15"/>
                 <w:szCs w:val="15"/>
               </w:rPr>
-              <w:t xml:space="preserve">Massi</w:t>
+              <w:t xml:space="preserve">Leon</w:t>
             </w:r>
           </w:p>
         </w:tc>
@@ -16692,7 +16661,7 @@
                 <w:sz w:val="16"/>
                 <w:szCs w:val="16"/>
               </w:rPr>
-              <w:t xml:space="preserve">2 Sofort-Paket bauen (L1 bis L7) und Preisseite bereinigen (M1)</w:t>
+              <w:t xml:space="preserve">2 Sofort-Paket bauen (L1 bis L7) und Preisseite bereinigen (L17)</w:t>
             </w:r>
           </w:p>
         </w:tc>
@@ -17457,7 +17426,7 @@
                 <w:sz w:val="15"/>
                 <w:szCs w:val="15"/>
               </w:rPr>
-              <w:t xml:space="preserve">M1, M12, L5, E2</w:t>
+              <w:t xml:space="preserve">L17, M12, L5, E2</w:t>
             </w:r>
           </w:p>
         </w:tc>

</xml_diff>

<commit_message>
No extra keyword pages for now, /heilberufe slug, M7 without G2
Extra pages /hwg-pruefung and /health-claims-pruefung would compete with
the home page and /hersteller; build only if Search Console shows demand.
Tür 3 page is /heilberufe. Crunchbase once, OMR basic profile until real
reviews exist, G2 dropped; 90-day target for external sources adjusted.

Co-Authored-By: Claude Opus 5.5 <noreply@anthropic.com>
Claude-Session: https://claude.ai/code/session_01NMQaoUeHEbPLTJ9CdvHzwP
</commit_message>
<xml_diff>
--- a/reports/2026-10-28_GEO/GEO-Massnahmenplan_PageCompliance_Teil2.docx
+++ b/reports/2026-10-28_GEO/GEO-Massnahmenplan_PageCompliance_Teil2.docx
@@ -10635,7 +10635,7 @@
                 <w:sz w:val="15"/>
                 <w:szCs w:val="15"/>
               </w:rPr>
-              <w:t xml:space="preserve">/heilpraktiker</w:t>
+              <w:t xml:space="preserve">/heilberufe</w:t>
             </w:r>
           </w:p>
         </w:tc>
@@ -10764,7 +10764,7 @@
                 <w:sz w:val="15"/>
                 <w:szCs w:val="15"/>
               </w:rPr>
-              <w:t xml:space="preserve">/hersteller</w:t>
+              <w:t xml:space="preserve">/hersteller („Nahrungsergänzungsmittel“ in Title und H1)</w:t>
             </w:r>
           </w:p>
         </w:tc>
@@ -11008,7 +11008,7 @@
           <w:sz w:val="20"/>
           <w:szCs w:val="20"/>
         </w:rPr>
-        <w:t xml:space="preserve">Ärzte und Heilpraktiker bekommen getrennte Seiten, obwohl dasselbe Paket dahinterliegt: Ärzte wollen nicht mit Heilpraktikern in einen Topf, und der Schmerz ist ein anderer. Preise auf diesen Seiten erst nach E2; Praxis 29 € und Hersteller 99 € sind Arbeitswerte.</w:t>
+        <w:t xml:space="preserve">Ärzte und Heilberufe bekommen getrennte Seiten, obwohl dasselbe Paket dahinterliegt: Ärzte wollen nicht mit Heilpraktikern in einen Topf, und der Schmerz ist ein anderer. /heilberufe statt /heilpraktiker, weil Tür 3 laut Leitfaden auch Physiotherapie, Osteopathie und Psychotherapeuten umfasst. /hersteller statt /nahrungsergaenzungsmittel, weil OTC- und RX-Hersteller später dazukommen. Preise auf diesen Seiten erst nach E2; Praxis 29 € und Hersteller 99 € sind Arbeitswerte.</w:t>
       </w:r>
     </w:p>
     <w:p>
@@ -11022,7 +11022,7 @@
           <w:sz w:val="20"/>
           <w:szCs w:val="20"/>
         </w:rPr>
-        <w:t xml:space="preserve">Suchanlässe für die Seite „Laufende Website-Prüfung“, abgeleitet aus Plan v1, Suchvolumen nicht gemessen: „Website laufend prüfen Heilmittelwerbegesetz“, „Praxis-Website überwachen Werbung“, „Kunden-Websites überwachen Agentur Gesundheit“, „Unterlassungserklärung Vertragsstrafe vermeiden Website“ (Heilberufe). Vor dem Schreiben in Search Console oder Keyword-Planer prüfen. Offen bleibt, ob zusätzlich Seiten für Kaufbegriffe wie /hwg-pruefung und /health-claims-pruefung kommen (Vorschlag der Strategie im Repo); das entscheidet die erste Messung, weil Google vor vervielfachten Seiten warnt.</w:t>
+        <w:t xml:space="preserve">Suchanlässe für die Seite „Laufende Website-Prüfung“, abgeleitet aus Plan v1, Suchvolumen nicht gemessen: „Website laufend prüfen Heilmittelwerbegesetz“, „Praxis-Website überwachen Werbung“, „Kunden-Websites überwachen Agentur Gesundheit“, „Unterlassungserklärung Vertragsstrafe vermeiden Website“ (Heilberufe). Vor dem Schreiben in Search Console oder Keyword-Planer prüfen. Keine zusätzlichen Seiten für Kaufbegriffe (Vorschlag der Strategie: /hwg-pruefung, /health-claims-pruefung). Sie würden mit vorhandenen Seiten um dieselben Suchbegriffe konkurrieren: Die Startseite übernimmt „Prüfung nach Heilmittelwerbegesetz“, die Hersteller-Seite „Health Claims prüfen“. Erst wenn die Search Console nach der ersten Messung viele Einblendungen für solche Begriffe ohne passende Seite zeigt, wird nachgebaut.</w:t>
       </w:r>
     </w:p>
     <w:p>
@@ -11100,7 +11100,7 @@
           <w:sz w:val="20"/>
           <w:szCs w:val="20"/>
         </w:rPr>
-        <w:t xml:space="preserve"> OMR Reviews (Basis-Profil kostenlos), Crunchbase, G2. Überall die Definition. Bewertungen nur von echten Kunden, nie gekauft. OMR nennt sich selbst die meistzitierte Quelle bei Software-Empfehlungen in DACH; das ist eine eigene Studie mit Eigeninteresse.</w:t>
+        <w:t xml:space="preserve"> Crunchbase einmal anlegen: bringt keine Kunden, aber eine fremde Quelle mit harten Fakten. OMR Reviews nur als Basis-Profil (kostenlos), dazu beide Kunden um eine ehrliche Bewertung bitten; ohne Bewertungen ist das Profil wertlos. Aktiv angehen erst ab etwa fünf echten Bewertungen (eigene Setzung) und nachdem die passende Kategorie geprüft ist. Kein G2: amerikanisch geprägt, für deutsche Gesundheitswerbung ohne erkennbaren Nutzen. Überall die Definition. Bewertungen nur von echten Kunden, nie gekauft. OMR nennt sich selbst die meistzitierte Quelle bei Software-Empfehlungen in DACH; das ist eine eigene Studie mit Eigeninteresse.</w:t>
       </w:r>
       <w:r>
         <w:rPr>
@@ -12568,7 +12568,7 @@
                 <w:sz w:val="15"/>
                 <w:szCs w:val="15"/>
               </w:rPr>
-              <w:t xml:space="preserve">OMR Reviews, Crunchbase, G2 anlegen</w:t>
+              <w:t xml:space="preserve">Crunchbase einmal anlegen; OMR-Basis-Profil anlegen und beide Kunden um Bewertung bitten; kein G2</w:t>
             </w:r>
           </w:p>
         </w:tc>
@@ -12599,7 +12599,7 @@
                 <w:sz w:val="15"/>
                 <w:szCs w:val="15"/>
               </w:rPr>
-              <w:t xml:space="preserve">drei Profile mit Definition</w:t>
+              <w:t xml:space="preserve">zwei Profile mit Definition; zwei Bewertungen angefragt</w:t>
             </w:r>
           </w:p>
         </w:tc>
@@ -15321,7 +15321,7 @@
                 <w:sz w:val="15"/>
                 <w:szCs w:val="15"/>
               </w:rPr>
-              <w:t xml:space="preserve">Seite /heilpraktiker, Kampagne</w:t>
+              <w:t xml:space="preserve">Seite /heilberufe, Kampagne</w:t>
             </w:r>
           </w:p>
         </w:tc>
@@ -16393,7 +16393,7 @@
                 <w:sz w:val="15"/>
                 <w:szCs w:val="15"/>
               </w:rPr>
-              <w:t xml:space="preserve">mindestens 5, mit M9 mindestens 7</w:t>
+              <w:t xml:space="preserve">mindestens 5</w:t>
             </w:r>
           </w:p>
         </w:tc>
@@ -16424,7 +16424,7 @@
                 <w:sz w:val="15"/>
                 <w:szCs w:val="15"/>
               </w:rPr>
-              <w:t xml:space="preserve">3 Verzeichnisse; mit M9 mindestens 2 Gastbeiträge</w:t>
+              <w:t xml:space="preserve">Crunchbase, OMR und mindestens eine Fundstelle bei einem Verband, einer Fachschule oder einer Agentur</w:t>
             </w:r>
           </w:p>
         </w:tc>
@@ -17134,7 +17134,7 @@
                 <w:sz w:val="16"/>
                 <w:szCs w:val="16"/>
               </w:rPr>
-              <w:t xml:space="preserve">Artikel 1 und 2 sind live, je mit LinkedIn-Beitrag; drei Verzeichnisse angelegt; falls M9 umgesetzt wird, sechs Agenturen angefragt</w:t>
+              <w:t xml:space="preserve">Artikel 1 und 2 sind live, je mit LinkedIn-Beitrag; Crunchbase und OMR angelegt; falls M9 umgesetzt wird, sechs Agenturen angefragt</w:t>
             </w:r>
           </w:p>
         </w:tc>

</xml_diff>

<commit_message>
Postpone OMR until more reviews are possible; mark campaign links
M7 is Crunchbase only; OMR follows once there are enough customers to
review, G2 stays dropped. L13 and M11 add UTM-marked campaign links and
the recommendation to keep Plausible. Speaking script updated with these
and the extra-page and /heilberufe decisions.

Co-Authored-By: Claude Opus 5.5 <noreply@anthropic.com>
Claude-Session: https://claude.ai/code/session_01NMQaoUeHEbPLTJ9CdvHzwP
</commit_message>
<xml_diff>
--- a/reports/2026-10-28_GEO/GEO-Massnahmenplan_PageCompliance_Teil2.docx
+++ b/reports/2026-10-28_GEO/GEO-Massnahmenplan_PageCompliance_Teil2.docx
@@ -5226,7 +5226,7 @@
           <w:sz w:val="20"/>
           <w:szCs w:val="20"/>
         </w:rPr>
-        <w:t xml:space="preserve">Jeder Text über PageCompliance trägt dieselbe Definition, wörtlich: Website, llms.txt, LinkedIn, Munich Startup, OMR Reviews, jeder Gastbeitrag.</w:t>
+        <w:t xml:space="preserve">Jeder Text über PageCompliance trägt dieselbe Definition, wörtlich: Website, llms.txt, LinkedIn, Munich Startup, Crunchbase, jeder Gastbeitrag.</w:t>
       </w:r>
     </w:p>
     <w:p>
@@ -11091,7 +11091,7 @@
           <w:sz w:val="20"/>
           <w:szCs w:val="20"/>
         </w:rPr>
-        <w:t xml:space="preserve">Verzeichnisse (M7, 30 Tage).</w:t>
+        <w:t xml:space="preserve">Crunchbase (M7, 30 Tage).</w:t>
       </w:r>
       <w:r>
         <w:rPr>
@@ -11100,13 +11100,7 @@
           <w:sz w:val="20"/>
           <w:szCs w:val="20"/>
         </w:rPr>
-        <w:t xml:space="preserve"> Crunchbase einmal anlegen: bringt keine Kunden, aber eine fremde Quelle mit harten Fakten. OMR Reviews nur als Basis-Profil (kostenlos), dazu beide Kunden um eine ehrliche Bewertung bitten; ohne Bewertungen ist das Profil wertlos. Aktiv angehen erst ab etwa fünf echten Bewertungen (eigene Setzung) und nachdem die passende Kategorie geprüft ist. Kein G2: amerikanisch geprägt, für deutsche Gesundheitswerbung ohne erkennbaren Nutzen. Überall die Definition. Bewertungen nur von echten Kunden, nie gekauft. OMR nennt sich selbst die meistzitierte Quelle bei Software-Empfehlungen in DACH; das ist eine eigene Studie mit Eigeninteresse.</w:t>
-      </w:r>
-      <w:r>
-        <w:rPr>
-          <w:rStyle w:val="FootnoteReference"/>
-        </w:rPr>
-        <w:footnoteReference w:id="17"/>
+        <w:t xml:space="preserve"> Einmal anlegen, mit Definition und Fakten, nicht pflegen. Bringt keine Kunden, aber eine fremde Quelle mit harten Fakten. OMR Reviews kommt erst, wenn wir größer sind und genug echte Bewertungen sammeln können; ein Profil ohne Bewertungen ist wertlos. G2 entfällt: amerikanisch geprägt, für deutsche Gesundheitswerbung ohne erkennbaren Nutzen.</w:t>
       </w:r>
     </w:p>
     <w:p>
@@ -12568,7 +12562,7 @@
                 <w:sz w:val="15"/>
                 <w:szCs w:val="15"/>
               </w:rPr>
-              <w:t xml:space="preserve">Crunchbase einmal anlegen; OMR-Basis-Profil anlegen und beide Kunden um Bewertung bitten; kein G2</w:t>
+              <w:t xml:space="preserve">Crunchbase einmal anlegen; OMR erst, wenn wir größer sind; kein G2</w:t>
             </w:r>
           </w:p>
         </w:tc>
@@ -12599,7 +12593,7 @@
                 <w:sz w:val="15"/>
                 <w:szCs w:val="15"/>
               </w:rPr>
-              <w:t xml:space="preserve">zwei Profile mit Definition; zwei Bewertungen angefragt</w:t>
+              <w:t xml:space="preserve">Crunchbase-Profil mit Definition ist live</w:t>
             </w:r>
           </w:p>
         </w:tc>
@@ -13818,7 +13812,7 @@
                 <w:sz w:val="16"/>
                 <w:szCs w:val="16"/>
               </w:rPr>
-              <w:t xml:space="preserve">L8 Firmen-Markup · L9 Suchbegriff unter der H1 · L10 /ueber-uns · L11 Blog-Vorlage (Stand, Autor, Aktenzeichen, Links) · L12 Weiterleitungen · L13 Messung in Plausible? · L14 Preis-Markup (nach E2)</w:t>
+              <w:t xml:space="preserve">L8 Firmen-Markup · L9 Suchbegriff unter der H1 · L10 /ueber-uns · L11 Blog-Vorlage (Stand, Autor, Aktenzeichen, Links) · L12 Weiterleitungen · L13 Messung (Plausible?, markierte Kampagnen-Links) · L14 Preis-Markup (nach E2)</w:t>
             </w:r>
           </w:p>
         </w:tc>
@@ -15646,7 +15640,7 @@
                 <w:sz w:val="15"/>
                 <w:szCs w:val="15"/>
               </w:rPr>
-              <w:t xml:space="preserve">Plausible beibehalten oder ein anderes Werkzeug für L13?</w:t>
+              <w:t xml:space="preserve">Plausible beibehalten oder ein anderes Werkzeug für L13? Empfehlung: behalten (Daten seit Juni, kein Cookie-Banner nötig laut Anbieter), Kampagnen-Links markieren</w:t>
             </w:r>
           </w:p>
         </w:tc>
@@ -15874,7 +15868,7 @@
         <w:rPr>
           <w:rStyle w:val="FootnoteReference"/>
         </w:rPr>
-        <w:footnoteReference w:id="18"/>
+        <w:footnoteReference w:id="17"/>
       </w:r>
       <w:r>
         <w:rPr>
@@ -16393,7 +16387,7 @@
                 <w:sz w:val="15"/>
                 <w:szCs w:val="15"/>
               </w:rPr>
-              <w:t xml:space="preserve">mindestens 5</w:t>
+              <w:t xml:space="preserve">mindestens 4</w:t>
             </w:r>
           </w:p>
         </w:tc>
@@ -16424,7 +16418,7 @@
                 <w:sz w:val="15"/>
                 <w:szCs w:val="15"/>
               </w:rPr>
-              <w:t xml:space="preserve">Crunchbase, OMR und mindestens eine Fundstelle bei einem Verband, einer Fachschule oder einer Agentur</w:t>
+              <w:t xml:space="preserve">LinkedIn und Munich Startup korrigiert, Crunchbase, mindestens eine Fundstelle bei einem Verband, einer Fachschule oder einer Agentur</w:t>
             </w:r>
           </w:p>
         </w:tc>
@@ -16682,7 +16676,7 @@
                 <w:sz w:val="15"/>
                 <w:szCs w:val="15"/>
               </w:rPr>
-              <w:t xml:space="preserve">Pricing 2.1; Plausible und Anmeldefeld (L13)</w:t>
+              <w:t xml:space="preserve">Pricing 2.1; Plausible, markierte Kampagnen-Links und Anmeldefeld (L13)</w:t>
             </w:r>
           </w:p>
         </w:tc>
@@ -17134,7 +17128,7 @@
                 <w:sz w:val="16"/>
                 <w:szCs w:val="16"/>
               </w:rPr>
-              <w:t xml:space="preserve">Artikel 1 und 2 sind live, je mit LinkedIn-Beitrag; Crunchbase und OMR angelegt; falls M9 umgesetzt wird, sechs Agenturen angefragt</w:t>
+              <w:t xml:space="preserve">Artikel 1 und 2 sind live, je mit LinkedIn-Beitrag; Crunchbase angelegt; falls M9 umgesetzt wird, sechs Agenturen angefragt</w:t>
             </w:r>
           </w:p>
         </w:tc>
@@ -18534,7 +18528,7 @@
                 <w:sz w:val="15"/>
                 <w:szCs w:val="15"/>
               </w:rPr>
-              <w:t xml:space="preserve">Google KI-Leitfaden; OMR</w:t>
+              <w:t xml:space="preserve">Google KI-Leitfaden</w:t>
             </w:r>
           </w:p>
         </w:tc>
@@ -22223,7 +22217,7 @@
                 <w:sz w:val="15"/>
                 <w:szCs w:val="15"/>
               </w:rPr>
-              <w:t xml:space="preserve">Munich Startup; OMR Reviews AGB und Studie</w:t>
+              <w:t xml:space="preserve">Munich Startup; Crunchbase</w:t>
             </w:r>
           </w:p>
         </w:tc>
@@ -22254,7 +22248,7 @@
                 <w:sz w:val="15"/>
                 <w:szCs w:val="15"/>
               </w:rPr>
-              <w:t xml:space="preserve">munich-startup.de/startups/pagecompliance · omr.com/de/reviews/vendor/agb</w:t>
+              <w:t xml:space="preserve">munich-startup.de/startups/pagecompliance · support.crunchbase.com</w:t>
             </w:r>
           </w:p>
         </w:tc>
@@ -22849,28 +22843,6 @@
           <w:sz w:val="14"/>
           <w:szCs w:val="14"/>
         </w:rPr>
-        <w:t xml:space="preserve">OMR Reviews: AGB für Software-Anbieter (Basis-Profil kostenlos); OMR und Radyant, „Quellen von LLMs bei Software-Empfehlungen“, Juni 2026. Eigene Studie von OMR, Interessenlage beachten.</w:t>
-      </w:r>
-    </w:p>
-  </w:footnote>
-  <w:footnote w:id="18">
-    <w:p>
-      <w:pPr>
-        <w:spacing w:after="40"/>
-      </w:pPr>
-      <w:r>
-        <w:rPr>
-          <w:rStyle w:val="FootnoteReference"/>
-        </w:rPr>
-        <w:footnoteRef/>
-      </w:r>
-      <w:r>
-        <w:rPr>
-          <w:rFonts w:ascii="Helvetica" w:cs="Helvetica" w:eastAsia="Helvetica" w:hAnsi="Helvetica"/>
-          <w:color w:val="444444"/>
-          <w:sz w:val="14"/>
-          <w:szCs w:val="14"/>
-        </w:rPr>
         <w:t xml:space="preserve">Setzungen dieses Plans. Sie leiten sich aus den geplanten Maßnahmen ab, nicht aus einer Prognose.</w:t>
       </w:r>
     </w:p>

</xml_diff>

<commit_message>
Blog categories for all four doors (L18), new article CTA, short links as open question
Articles end with "Drei Texte im Monat kostenlos prüfen" since free
tier with 3 checks per month is live. Leon adds blog categories for
Agenturen, Ärzte, Heilberufe, Hersteller as landing pages for campaigns.
Own short links stay an open question in plan, sheets and script.

Co-Authored-By: Claude Opus 5.5 <noreply@anthropic.com>
Claude-Session: https://claude.ai/code/session_01NMQaoUeHEbPLTJ9CdvHzwP
</commit_message>
<xml_diff>
--- a/reports/2026-10-28_GEO/GEO-Massnahmenplan_PageCompliance_Teil2.docx
+++ b/reports/2026-10-28_GEO/GEO-Massnahmenplan_PageCompliance_Teil2.docx
@@ -302,7 +302,7 @@
           <w:sz w:val="20"/>
           <w:szCs w:val="20"/>
         </w:rPr>
-        <w:t xml:space="preserve"> Jede Seite beantwortet eine Frage, die Käufer nachweislich stellen, im festen Format: riskanter Satz, Norm, besserer Satz, „Ihren Satz kostenlos prüfen“. So wird jeder Artikel zur Produktvorführung und zum Einstieg in die drei Gratis-Prüfungen jeden Monat.</w:t>
+        <w:t xml:space="preserve"> Jede Seite beantwortet eine Frage, die Käufer nachweislich stellen, im festen Format: riskanter Satz, Norm, besserer Satz, „Drei Texte im Monat kostenlos prüfen“. So wird jeder Artikel zur Produktvorführung und zum Einstieg in die drei Gratis-Prüfungen jeden Monat.</w:t>
       </w:r>
     </w:p>
     <w:p>
@@ -1529,7 +1529,7 @@
                 <w:sz w:val="16"/>
                 <w:szCs w:val="16"/>
               </w:rPr>
-              <w:t xml:space="preserve">fester Aufbau jeder Ratgeber-Seite: Kurzantwort, riskanter Satz, Norm, wann es doch geht, bessere Sätze, Agentur-Hinweis, „Ihren Satz kostenlos prüfen“</w:t>
+              <w:t xml:space="preserve">fester Aufbau jeder Ratgeber-Seite: Kurzantwort, riskanter Satz, Norm, wann es doch geht, bessere Sätze, Agentur-Hinweis, „Drei Texte im Monat kostenlos prüfen“</w:t>
             </w:r>
           </w:p>
         </w:tc>
@@ -4098,7 +4098,7 @@
           <w:sz w:val="20"/>
           <w:szCs w:val="20"/>
         </w:rPr>
-        <w:t xml:space="preserve"> Kurzantwort in zwei Sätzen, der riskante Satz, Norm und Aktenzeichen, wann es doch geht, drei bessere Sätze, ein Agentur-Hinweis, „Ihren Satz kostenlos prüfen“, sichtbares Stand-Datum und Autor. Das Format ist die Produktvorführung: Befund, Norm, besserer Satz.</w:t>
+        <w:t xml:space="preserve"> Kurzantwort in zwei Sätzen, der riskante Satz, Norm und Aktenzeichen, wann es doch geht, drei bessere Sätze, ein Agentur-Hinweis, „Drei Texte im Monat kostenlos prüfen“, sichtbares Stand-Datum und Autor. Das Format ist die Produktvorführung: Befund, Norm, besserer Satz.</w:t>
       </w:r>
     </w:p>
     <w:p>
@@ -10136,7 +10136,7 @@
           <w:sz w:val="20"/>
           <w:szCs w:val="20"/>
         </w:rPr>
-        <w:t xml:space="preserve"> Risiko vorne, Ruhe am Ende. Der Artikel endet mit dem besseren Satz und „Ihren Satz kostenlos prüfen“, nicht mit dem Strafrahmen. </w:t>
+        <w:t xml:space="preserve"> Risiko vorne, Ruhe am Ende. Der Artikel endet mit dem besseren Satz und „Drei Texte im Monat kostenlos prüfen“, nicht mit dem Strafrahmen. </w:t>
       </w:r>
       <w:r>
         <w:rPr>
@@ -10157,6 +10157,37 @@
           <w:szCs w:val="20"/>
         </w:rPr>
         <w:t xml:space="preserve"> Fremde Preise nur mit Quelle, Datum und Screenshot. Die Seite stellt Kategorien dar, nicht Wettbewerber bloß (§ 6 UWG), und wird vor Veröffentlichung gegengelesen (M14).</w:t>
+      </w:r>
+    </w:p>
+    <w:p>
+      <w:pPr>
+        <w:keepNext/>
+        <w:spacing w:after="80" w:before="160"/>
+      </w:pPr>
+      <w:r>
+        <w:rPr>
+          <w:rFonts w:ascii="Helvetica" w:cs="Helvetica" w:eastAsia="Helvetica" w:hAnsi="Helvetica"/>
+          <w:b/>
+          <w:bCs/>
+          <w:color w:val="1A1A1A"/>
+          <w:sz w:val="19"/>
+          <w:szCs w:val="19"/>
+        </w:rPr>
+        <w:t xml:space="preserve">Blog-Kategorien je Tür (30 Tage)</w:t>
+      </w:r>
+    </w:p>
+    <w:p>
+      <w:pPr>
+        <w:spacing w:after="140" w:line="300"/>
+      </w:pPr>
+      <w:r>
+        <w:rPr>
+          <w:rFonts w:ascii="Helvetica" w:cs="Helvetica" w:eastAsia="Helvetica" w:hAnsi="Helvetica"/>
+          <w:color w:val="1A1A1A"/>
+          <w:sz w:val="20"/>
+          <w:szCs w:val="20"/>
+        </w:rPr>
+        <w:t xml:space="preserve">Der Blog ist der Landeplatz für alle Themen-Kampagnen, für alle vier Türen, auch für Agenturen: Die Texterin googelt die Praxisfragen ihrer Kunden, und der Agentur-Artikel steht schon auf Platz 1. Leon legt deshalb vier Kategorien an: Agenturen, Ärzte, Heilberufe, Hersteller (L18). Jeder Artikel bekommt eine oder mehrere Türen, wie in der Tabelle oben. Eine Kampagne kann so auf einen Artikel oder auf alle Artikel einer Tür zeigen. Bis die Produktseiten je Tür stehen, sind die Kategorien deren Zwischenlösung; danach verlinkt jede Produktseite ihre Kategorie. Jeder Artikel endet mit „Drei Texte im Monat kostenlos prüfen“; Gratis mit 3 Prüfungen im Monat ist aktiv.</w:t>
       </w:r>
     </w:p>
     <w:p>
@@ -13812,7 +13843,7 @@
                 <w:sz w:val="16"/>
                 <w:szCs w:val="16"/>
               </w:rPr>
-              <w:t xml:space="preserve">L8 Firmen-Markup · L9 Suchbegriff unter der H1 · L10 /ueber-uns · L11 Blog-Vorlage (Stand, Autor, Aktenzeichen, Links) · L12 Weiterleitungen · L13 Messung (Plausible?, markierte Kampagnen-Links) · L14 Preis-Markup (nach E2)</w:t>
+              <w:t xml:space="preserve">L8 Firmen-Markup · L9 Suchbegriff unter der H1 · L10 /ueber-uns · L11 Blog-Vorlage (Stand, Autor, Aktenzeichen, Links) · L12 Weiterleitungen · L13 Messung (Plausible?, markierte Kampagnen-Links) · L14 Preis-Markup (nach E2) · L18 Blog-Kategorien je Tür</w:t>
             </w:r>
           </w:p>
         </w:tc>
@@ -14339,7 +14370,7 @@
                 <w:sz w:val="15"/>
                 <w:szCs w:val="15"/>
               </w:rPr>
-              <w:t xml:space="preserve">Live: Starter 99 €, Professional 349 €, Enterprise 699 €, Gratis 2.400 Wörter ohne Konto. Entschieden laut Pricing: Gratis, Agentur 99 €, Team 249 €. Arbeitswerte: Praxis 29 €, Hersteller 99 €, Einzel-Audit 149 €.</w:t>
+              <w:t xml:space="preserve">Preisseite live am 27.10.: Starter 99 €, Professional 349 €, Enterprise 699 €, Gratis 2.400 Wörter ohne Konto. Gratis mit 3 Prüfungen im Monat ist inzwischen aktiv (Stand 28.10.). Entschieden laut Pricing: Gratis, Agentur 99 €, Team 249 €. Arbeitswerte: Praxis 29 €, Hersteller 99 €, Einzel-Audit 149 €.</w:t>
             </w:r>
           </w:p>
         </w:tc>
@@ -15574,6 +15605,135 @@
                 <w:szCs w:val="15"/>
               </w:rPr>
               <w:t xml:space="preserve">App-Name, Start</w:t>
+            </w:r>
+          </w:p>
+        </w:tc>
+      </w:tr>
+      <w:tr>
+        <w:trPr>
+          <w:cantSplit/>
+        </w:trPr>
+        <w:tc>
+          <w:tcPr>
+            <w:tcW w:type="dxa" w:w="2233"/>
+            <w:tcBorders>
+              <w:top w:val="none" w:color="FFFFFF" w:sz="0"/>
+              <w:left w:val="none" w:color="FFFFFF" w:sz="0"/>
+              <w:bottom w:val="single" w:color="D6D6D6" w:sz="4"/>
+              <w:right w:val="none" w:color="FFFFFF" w:sz="0"/>
+            </w:tcBorders>
+            <w:tcMar>
+              <w:top w:type="dxa" w:w="60"/>
+              <w:left w:type="dxa" w:w="80"/>
+              <w:bottom w:type="dxa" w:w="60"/>
+              <w:right w:type="dxa" w:w="80"/>
+            </w:tcMar>
+          </w:tcPr>
+          <w:p>
+            <w:pPr>
+              <w:spacing w:after="0" w:line="250"/>
+            </w:pPr>
+            <w:r>
+              <w:rPr>
+                <w:rFonts w:ascii="Helvetica" w:cs="Helvetica" w:eastAsia="Helvetica" w:hAnsi="Helvetica"/>
+                <w:color w:val="1A1A1A"/>
+                <w:sz w:val="15"/>
+                <w:szCs w:val="15"/>
+              </w:rPr>
+              <w:t xml:space="preserve">Kurzlinks für Kampagnen</w:t>
+            </w:r>
+          </w:p>
+        </w:tc>
+        <w:tc>
+          <w:tcPr>
+            <w:tcW w:type="dxa" w:w="3536"/>
+            <w:tcBorders>
+              <w:top w:val="none" w:color="FFFFFF" w:sz="0"/>
+              <w:left w:val="none" w:color="FFFFFF" w:sz="0"/>
+              <w:bottom w:val="single" w:color="D6D6D6" w:sz="4"/>
+              <w:right w:val="none" w:color="FFFFFF" w:sz="0"/>
+            </w:tcBorders>
+            <w:tcMar>
+              <w:top w:type="dxa" w:w="60"/>
+              <w:left w:type="dxa" w:w="80"/>
+              <w:bottom w:type="dxa" w:w="60"/>
+              <w:right w:type="dxa" w:w="80"/>
+            </w:tcMar>
+          </w:tcPr>
+          <w:p>
+            <w:pPr>
+              <w:spacing w:after="0" w:line="250"/>
+            </w:pPr>
+            <w:r>
+              <w:rPr>
+                <w:rFonts w:ascii="Helvetica" w:cs="Helvetica" w:eastAsia="Helvetica" w:hAnsi="Helvetica"/>
+                <w:color w:val="1A1A1A"/>
+                <w:sz w:val="15"/>
+                <w:szCs w:val="15"/>
+              </w:rPr>
+              <w:t xml:space="preserve">Eigene Kurzlinks wie pagecompliance.de/go/hp-satz für Bio-Links, Stories, QR-Codes und Print? Arbeitsnotiz „Kampagnen-Links“ im Repo</w:t>
+            </w:r>
+          </w:p>
+        </w:tc>
+        <w:tc>
+          <w:tcPr>
+            <w:tcW w:type="dxa" w:w="1675"/>
+            <w:tcBorders>
+              <w:top w:val="none" w:color="FFFFFF" w:sz="0"/>
+              <w:left w:val="none" w:color="FFFFFF" w:sz="0"/>
+              <w:bottom w:val="single" w:color="D6D6D6" w:sz="4"/>
+              <w:right w:val="none" w:color="FFFFFF" w:sz="0"/>
+            </w:tcBorders>
+            <w:tcMar>
+              <w:top w:type="dxa" w:w="60"/>
+              <w:left w:type="dxa" w:w="80"/>
+              <w:bottom w:type="dxa" w:w="60"/>
+              <w:right w:type="dxa" w:w="80"/>
+            </w:tcMar>
+          </w:tcPr>
+          <w:p>
+            <w:pPr>
+              <w:spacing w:after="0" w:line="250"/>
+            </w:pPr>
+            <w:r>
+              <w:rPr>
+                <w:rFonts w:ascii="Helvetica" w:cs="Helvetica" w:eastAsia="Helvetica" w:hAnsi="Helvetica"/>
+                <w:color w:val="1A1A1A"/>
+                <w:sz w:val="15"/>
+                <w:szCs w:val="15"/>
+              </w:rPr>
+              <w:t xml:space="preserve">Massi und Leon</w:t>
+            </w:r>
+          </w:p>
+        </w:tc>
+        <w:tc>
+          <w:tcPr>
+            <w:tcW w:type="dxa" w:w="1862"/>
+            <w:tcBorders>
+              <w:top w:val="none" w:color="FFFFFF" w:sz="0"/>
+              <w:left w:val="none" w:color="FFFFFF" w:sz="0"/>
+              <w:bottom w:val="single" w:color="D6D6D6" w:sz="4"/>
+              <w:right w:val="none" w:color="FFFFFF" w:sz="0"/>
+            </w:tcBorders>
+            <w:tcMar>
+              <w:top w:type="dxa" w:w="60"/>
+              <w:left w:type="dxa" w:w="80"/>
+              <w:bottom w:type="dxa" w:w="60"/>
+              <w:right w:type="dxa" w:w="80"/>
+            </w:tcMar>
+          </w:tcPr>
+          <w:p>
+            <w:pPr>
+              <w:spacing w:after="0" w:line="250"/>
+            </w:pPr>
+            <w:r>
+              <w:rPr>
+                <w:rFonts w:ascii="Helvetica" w:cs="Helvetica" w:eastAsia="Helvetica" w:hAnsi="Helvetica"/>
+                <w:color w:val="1A1A1A"/>
+                <w:sz w:val="15"/>
+                <w:szCs w:val="15"/>
+              </w:rPr>
+              <w:t xml:space="preserve">Messung der Kampagnen</w:t>
             </w:r>
           </w:p>
         </w:tc>
@@ -19045,6 +19205,135 @@
                 <w:szCs w:val="15"/>
               </w:rPr>
               <w:t xml:space="preserve">Anthropic Help Center; OpenAI-Dokumentation; Common Crawl</w:t>
+            </w:r>
+          </w:p>
+        </w:tc>
+      </w:tr>
+      <w:tr>
+        <w:trPr>
+          <w:cantSplit/>
+        </w:trPr>
+        <w:tc>
+          <w:tcPr>
+            <w:tcW w:type="dxa" w:w="1489"/>
+            <w:tcBorders>
+              <w:top w:val="none" w:color="FFFFFF" w:sz="0"/>
+              <w:left w:val="none" w:color="FFFFFF" w:sz="0"/>
+              <w:bottom w:val="single" w:color="D6D6D6" w:sz="4"/>
+              <w:right w:val="none" w:color="FFFFFF" w:sz="0"/>
+            </w:tcBorders>
+            <w:tcMar>
+              <w:top w:type="dxa" w:w="60"/>
+              <w:left w:type="dxa" w:w="80"/>
+              <w:bottom w:type="dxa" w:w="60"/>
+              <w:right w:type="dxa" w:w="80"/>
+            </w:tcMar>
+          </w:tcPr>
+          <w:p>
+            <w:pPr>
+              <w:spacing w:after="0" w:line="250"/>
+            </w:pPr>
+            <w:r>
+              <w:rPr>
+                <w:rFonts w:ascii="Helvetica" w:cs="Helvetica" w:eastAsia="Helvetica" w:hAnsi="Helvetica"/>
+                <w:color w:val="1A1A1A"/>
+                <w:sz w:val="15"/>
+                <w:szCs w:val="15"/>
+              </w:rPr>
+              <w:t xml:space="preserve">L18</w:t>
+            </w:r>
+          </w:p>
+        </w:tc>
+        <w:tc>
+          <w:tcPr>
+            <w:tcW w:type="dxa" w:w="2606"/>
+            <w:tcBorders>
+              <w:top w:val="none" w:color="FFFFFF" w:sz="0"/>
+              <w:left w:val="none" w:color="FFFFFF" w:sz="0"/>
+              <w:bottom w:val="single" w:color="D6D6D6" w:sz="4"/>
+              <w:right w:val="none" w:color="FFFFFF" w:sz="0"/>
+            </w:tcBorders>
+            <w:tcMar>
+              <w:top w:type="dxa" w:w="60"/>
+              <w:left w:type="dxa" w:w="80"/>
+              <w:bottom w:type="dxa" w:w="60"/>
+              <w:right w:type="dxa" w:w="80"/>
+            </w:tcMar>
+          </w:tcPr>
+          <w:p>
+            <w:pPr>
+              <w:spacing w:after="0" w:line="250"/>
+            </w:pPr>
+            <w:r>
+              <w:rPr>
+                <w:rFonts w:ascii="Helvetica" w:cs="Helvetica" w:eastAsia="Helvetica" w:hAnsi="Helvetica"/>
+                <w:color w:val="1A1A1A"/>
+                <w:sz w:val="15"/>
+                <w:szCs w:val="15"/>
+              </w:rPr>
+              <w:t xml:space="preserve">Blog-Kategorien je Tür</w:t>
+            </w:r>
+          </w:p>
+        </w:tc>
+        <w:tc>
+          <w:tcPr>
+            <w:tcW w:type="dxa" w:w="2978"/>
+            <w:tcBorders>
+              <w:top w:val="none" w:color="FFFFFF" w:sz="0"/>
+              <w:left w:val="none" w:color="FFFFFF" w:sz="0"/>
+              <w:bottom w:val="single" w:color="D6D6D6" w:sz="4"/>
+              <w:right w:val="none" w:color="FFFFFF" w:sz="0"/>
+            </w:tcBorders>
+            <w:tcMar>
+              <w:top w:type="dxa" w:w="60"/>
+              <w:left w:type="dxa" w:w="80"/>
+              <w:bottom w:type="dxa" w:w="60"/>
+              <w:right w:type="dxa" w:w="80"/>
+            </w:tcMar>
+          </w:tcPr>
+          <w:p>
+            <w:pPr>
+              <w:spacing w:after="0" w:line="250"/>
+            </w:pPr>
+            <w:r>
+              <w:rPr>
+                <w:rFonts w:ascii="Helvetica" w:cs="Helvetica" w:eastAsia="Helvetica" w:hAnsi="Helvetica"/>
+                <w:color w:val="1A1A1A"/>
+                <w:sz w:val="15"/>
+                <w:szCs w:val="15"/>
+              </w:rPr>
+              <w:t xml:space="preserve">Kampagnen brauchen einen Landeplatz je Tür, bevor die Produktseiten stehen</w:t>
+            </w:r>
+          </w:p>
+        </w:tc>
+        <w:tc>
+          <w:tcPr>
+            <w:tcW w:type="dxa" w:w="2233"/>
+            <w:tcBorders>
+              <w:top w:val="none" w:color="FFFFFF" w:sz="0"/>
+              <w:left w:val="none" w:color="FFFFFF" w:sz="0"/>
+              <w:bottom w:val="single" w:color="D6D6D6" w:sz="4"/>
+              <w:right w:val="none" w:color="FFFFFF" w:sz="0"/>
+            </w:tcBorders>
+            <w:tcMar>
+              <w:top w:type="dxa" w:w="60"/>
+              <w:left w:type="dxa" w:w="80"/>
+              <w:bottom w:type="dxa" w:w="60"/>
+              <w:right w:type="dxa" w:w="80"/>
+            </w:tcMar>
+          </w:tcPr>
+          <w:p>
+            <w:pPr>
+              <w:spacing w:after="0" w:line="250"/>
+            </w:pPr>
+            <w:r>
+              <w:rPr>
+                <w:rFonts w:ascii="Helvetica" w:cs="Helvetica" w:eastAsia="Helvetica" w:hAnsi="Helvetica"/>
+                <w:color w:val="1A1A1A"/>
+                <w:sz w:val="15"/>
+                <w:szCs w:val="15"/>
+              </w:rPr>
+              <w:t xml:space="preserve">Marketing-Schlüssel 2 und 9</w:t>
             </w:r>
           </w:p>
         </w:tc>

</xml_diff>